<commit_message>
Update ビブス/タオル icons; move ユニフォーム to match-only
</commit_message>
<xml_diff>
--- a/scratchpad/soccer_checklist.docx
+++ b/scratchpad/soccer_checklist.docx
@@ -237,7 +237,7 @@
                 <w:sz w:val="32"/>
                 <w:szCs w:val="32"/>
               </w:rPr>
-              <w:t xml:space="preserve">🦺</w:t>
+              <w:t xml:space="preserve">🎽</w:t>
             </w:r>
           </w:p>
           <w:p>
@@ -315,7 +315,7 @@
                 <w:sz w:val="32"/>
                 <w:szCs w:val="32"/>
               </w:rPr>
-              <w:t xml:space="preserve">🧻</w:t>
+              <w:t xml:space="preserve">🧖</w:t>
             </w:r>
           </w:p>
           <w:p>
@@ -471,7 +471,7 @@
                 <w:sz w:val="32"/>
                 <w:szCs w:val="32"/>
               </w:rPr>
-              <w:t xml:space="preserve">👕</w:t>
+              <w:t xml:space="preserve">🍬</w:t>
             </w:r>
           </w:p>
           <w:p>
@@ -486,7 +486,7 @@
                 <w:sz w:val="18"/>
                 <w:szCs w:val="18"/>
               </w:rPr>
-              <w:t xml:space="preserve">ユニフォーム</w:t>
+              <w:t xml:space="preserve">塩分チャージ</w:t>
             </w:r>
           </w:p>
         </w:tc>
@@ -510,7 +510,7 @@
                 <w:sz w:val="32"/>
                 <w:szCs w:val="32"/>
               </w:rPr>
-              <w:t xml:space="preserve">🍬</w:t>
+              <w:t xml:space="preserve">👟</w:t>
             </w:r>
           </w:p>
           <w:p>
@@ -525,14 +525,14 @@
                 <w:sz w:val="18"/>
                 <w:szCs w:val="18"/>
               </w:rPr>
-              <w:t xml:space="preserve">塩分チャージ</w:t>
-            </w:r>
-          </w:p>
-        </w:tc>
-        <w:tc>
-          <w:tcPr>
-            <w:tcW w:type="dxa" w:w="900"/>
-            <w:shd w:fill="BBDEFB" w:color="auto" w:val="clear"/>
+              <w:t xml:space="preserve">帰りの靴</w:t>
+            </w:r>
+          </w:p>
+        </w:tc>
+        <w:tc>
+          <w:tcPr>
+            <w:tcW w:type="dxa" w:w="900"/>
+            <w:shd w:fill="F8BBD0" w:color="auto" w:val="clear"/>
             <w:tcMar>
               <w:top w:type="dxa" w:w="80"/>
               <w:left w:type="dxa" w:w="60"/>
@@ -549,46 +549,7 @@
                 <w:sz w:val="32"/>
                 <w:szCs w:val="32"/>
               </w:rPr>
-              <w:t xml:space="preserve">👟</w:t>
-            </w:r>
-          </w:p>
-          <w:p>
-            <w:pPr>
-              <w:jc w:val="center"/>
-            </w:pPr>
-            <w:r>
-              <w:rPr>
-                <w:b/>
-                <w:bCs/>
-                <w:color w:val="1565C0"/>
-                <w:sz w:val="18"/>
-                <w:szCs w:val="18"/>
-              </w:rPr>
-              <w:t xml:space="preserve">帰りの靴</w:t>
-            </w:r>
-          </w:p>
-        </w:tc>
-        <w:tc>
-          <w:tcPr>
-            <w:tcW w:type="dxa" w:w="900"/>
-            <w:shd w:fill="F8BBD0" w:color="auto" w:val="clear"/>
-            <w:tcMar>
-              <w:top w:type="dxa" w:w="80"/>
-              <w:left w:type="dxa" w:w="60"/>
-              <w:bottom w:type="dxa" w:w="80"/>
-              <w:right w:type="dxa" w:w="60"/>
-            </w:tcMar>
-          </w:tcPr>
-          <w:p>
-            <w:pPr>
-              <w:jc w:val="center"/>
-            </w:pPr>
-            <w:r>
-              <w:rPr>
-                <w:sz w:val="32"/>
-                <w:szCs w:val="32"/>
-              </w:rPr>
-              <w:t xml:space="preserve">🪑</w:t>
+              <w:t xml:space="preserve">👕</w:t>
             </w:r>
           </w:p>
           <w:p>
@@ -603,7 +564,7 @@
                 <w:sz w:val="18"/>
                 <w:szCs w:val="18"/>
               </w:rPr>
-              <w:t xml:space="preserve">椅子</w:t>
+              <w:t xml:space="preserve">ユニフォーム</w:t>
             </w:r>
           </w:p>
         </w:tc>
@@ -627,7 +588,7 @@
                 <w:sz w:val="32"/>
                 <w:szCs w:val="32"/>
               </w:rPr>
-              <w:t xml:space="preserve">📷</w:t>
+              <w:t xml:space="preserve">🪑</w:t>
             </w:r>
           </w:p>
           <w:p>
@@ -642,7 +603,7 @@
                 <w:sz w:val="18"/>
                 <w:szCs w:val="18"/>
               </w:rPr>
-              <w:t xml:space="preserve">三脚</w:t>
+              <w:t xml:space="preserve">椅子</w:t>
             </w:r>
           </w:p>
         </w:tc>
@@ -666,7 +627,7 @@
                 <w:sz w:val="32"/>
                 <w:szCs w:val="32"/>
               </w:rPr>
-              <w:t xml:space="preserve">📱</w:t>
+              <w:t xml:space="preserve">📷</w:t>
             </w:r>
           </w:p>
           <w:p>
@@ -681,6 +642,45 @@
                 <w:sz w:val="18"/>
                 <w:szCs w:val="18"/>
               </w:rPr>
+              <w:t xml:space="preserve">三脚</w:t>
+            </w:r>
+          </w:p>
+        </w:tc>
+        <w:tc>
+          <w:tcPr>
+            <w:tcW w:type="dxa" w:w="900"/>
+            <w:shd w:fill="F8BBD0" w:color="auto" w:val="clear"/>
+            <w:tcMar>
+              <w:top w:type="dxa" w:w="80"/>
+              <w:left w:type="dxa" w:w="60"/>
+              <w:bottom w:type="dxa" w:w="80"/>
+              <w:right w:type="dxa" w:w="60"/>
+            </w:tcMar>
+          </w:tcPr>
+          <w:p>
+            <w:pPr>
+              <w:jc w:val="center"/>
+            </w:pPr>
+            <w:r>
+              <w:rPr>
+                <w:sz w:val="32"/>
+                <w:szCs w:val="32"/>
+              </w:rPr>
+              <w:t xml:space="preserve">📱</w:t>
+            </w:r>
+          </w:p>
+          <w:p>
+            <w:pPr>
+              <w:jc w:val="center"/>
+            </w:pPr>
+            <w:r>
+              <w:rPr>
+                <w:b/>
+                <w:bCs/>
+                <w:color w:val="AD1457"/>
+                <w:sz w:val="18"/>
+                <w:szCs w:val="18"/>
+              </w:rPr>
               <w:t xml:space="preserve">タブレット</w:t>
             </w:r>
           </w:p>
@@ -709,8 +709,8 @@
         </w:tc>
         <w:tc>
           <w:tcPr>
-            <w:tcW w:type="dxa" w:w="10800"/>
-            <w:gridSpan w:val="12"/>
+            <w:tcW w:type="dxa" w:w="9900"/>
+            <w:gridSpan w:val="11"/>
             <w:shd w:fill="1565C0" w:color="auto" w:val="clear"/>
             <w:tcMar>
               <w:top w:type="dxa" w:w="80"/>
@@ -737,8 +737,8 @@
         </w:tc>
         <w:tc>
           <w:tcPr>
-            <w:tcW w:type="dxa" w:w="2700"/>
-            <w:gridSpan w:val="3"/>
+            <w:tcW w:type="dxa" w:w="3600"/>
+            <w:gridSpan w:val="4"/>
             <w:shd w:fill="AD1457" w:color="auto" w:val="clear"/>
             <w:tcMar>
               <w:top w:type="dxa" w:w="80"/>
@@ -1070,21 +1070,21 @@
         <w:tc>
           <w:tcPr>
             <w:tcW w:type="dxa" w:w="900"/>
-            <w:shd w:fill="E3F2FD" w:color="auto" w:val="clear"/>
-            <w:tcMar>
-              <w:top w:type="dxa" w:w="80"/>
-              <w:left w:type="dxa" w:w="60"/>
-              <w:bottom w:type="dxa" w:w="80"/>
-              <w:right w:type="dxa" w:w="60"/>
-            </w:tcMar>
-          </w:tcPr>
-          <w:p>
-            <w:pPr>
-              <w:jc w:val="center"/>
-            </w:pPr>
-            <w:r>
-              <w:rPr>
-                <w:color w:val="1565C0"/>
+            <w:shd w:fill="FCE4EC" w:color="auto" w:val="clear"/>
+            <w:tcMar>
+              <w:top w:type="dxa" w:w="80"/>
+              <w:left w:type="dxa" w:w="60"/>
+              <w:bottom w:type="dxa" w:w="80"/>
+              <w:right w:type="dxa" w:w="60"/>
+            </w:tcMar>
+          </w:tcPr>
+          <w:p>
+            <w:pPr>
+              <w:jc w:val="center"/>
+            </w:pPr>
+            <w:r>
+              <w:rPr>
+                <w:color w:val="AD1457"/>
                 <w:sz w:val="30"/>
                 <w:szCs w:val="30"/>
               </w:rPr>
@@ -1488,7 +1488,7 @@
             </w:pPr>
             <w:r>
               <w:rPr>
-                <w:color w:val="1565C0"/>
+                <w:color w:val="AD1457"/>
                 <w:sz w:val="30"/>
                 <w:szCs w:val="30"/>
               </w:rPr>
@@ -1878,21 +1878,21 @@
         <w:tc>
           <w:tcPr>
             <w:tcW w:type="dxa" w:w="900"/>
-            <w:shd w:fill="E3F2FD" w:color="auto" w:val="clear"/>
-            <w:tcMar>
-              <w:top w:type="dxa" w:w="80"/>
-              <w:left w:type="dxa" w:w="60"/>
-              <w:bottom w:type="dxa" w:w="80"/>
-              <w:right w:type="dxa" w:w="60"/>
-            </w:tcMar>
-          </w:tcPr>
-          <w:p>
-            <w:pPr>
-              <w:jc w:val="center"/>
-            </w:pPr>
-            <w:r>
-              <w:rPr>
-                <w:color w:val="1565C0"/>
+            <w:shd w:fill="FCE4EC" w:color="auto" w:val="clear"/>
+            <w:tcMar>
+              <w:top w:type="dxa" w:w="80"/>
+              <w:left w:type="dxa" w:w="60"/>
+              <w:bottom w:type="dxa" w:w="80"/>
+              <w:right w:type="dxa" w:w="60"/>
+            </w:tcMar>
+          </w:tcPr>
+          <w:p>
+            <w:pPr>
+              <w:jc w:val="center"/>
+            </w:pPr>
+            <w:r>
+              <w:rPr>
+                <w:color w:val="AD1457"/>
                 <w:sz w:val="30"/>
                 <w:szCs w:val="30"/>
               </w:rPr>
@@ -2296,7 +2296,7 @@
             </w:pPr>
             <w:r>
               <w:rPr>
-                <w:color w:val="1565C0"/>
+                <w:color w:val="AD1457"/>
                 <w:sz w:val="30"/>
                 <w:szCs w:val="30"/>
               </w:rPr>
@@ -2686,21 +2686,21 @@
         <w:tc>
           <w:tcPr>
             <w:tcW w:type="dxa" w:w="900"/>
-            <w:shd w:fill="E3F2FD" w:color="auto" w:val="clear"/>
-            <w:tcMar>
-              <w:top w:type="dxa" w:w="80"/>
-              <w:left w:type="dxa" w:w="60"/>
-              <w:bottom w:type="dxa" w:w="80"/>
-              <w:right w:type="dxa" w:w="60"/>
-            </w:tcMar>
-          </w:tcPr>
-          <w:p>
-            <w:pPr>
-              <w:jc w:val="center"/>
-            </w:pPr>
-            <w:r>
-              <w:rPr>
-                <w:color w:val="1565C0"/>
+            <w:shd w:fill="FCE4EC" w:color="auto" w:val="clear"/>
+            <w:tcMar>
+              <w:top w:type="dxa" w:w="80"/>
+              <w:left w:type="dxa" w:w="60"/>
+              <w:bottom w:type="dxa" w:w="80"/>
+              <w:right w:type="dxa" w:w="60"/>
+            </w:tcMar>
+          </w:tcPr>
+          <w:p>
+            <w:pPr>
+              <w:jc w:val="center"/>
+            </w:pPr>
+            <w:r>
+              <w:rPr>
+                <w:color w:val="AD1457"/>
                 <w:sz w:val="30"/>
                 <w:szCs w:val="30"/>
               </w:rPr>
@@ -3104,7 +3104,7 @@
             </w:pPr>
             <w:r>
               <w:rPr>
-                <w:color w:val="1565C0"/>
+                <w:color w:val="AD1457"/>
                 <w:sz w:val="30"/>
                 <w:szCs w:val="30"/>
               </w:rPr>
@@ -3494,21 +3494,21 @@
         <w:tc>
           <w:tcPr>
             <w:tcW w:type="dxa" w:w="900"/>
-            <w:shd w:fill="E3F2FD" w:color="auto" w:val="clear"/>
-            <w:tcMar>
-              <w:top w:type="dxa" w:w="80"/>
-              <w:left w:type="dxa" w:w="60"/>
-              <w:bottom w:type="dxa" w:w="80"/>
-              <w:right w:type="dxa" w:w="60"/>
-            </w:tcMar>
-          </w:tcPr>
-          <w:p>
-            <w:pPr>
-              <w:jc w:val="center"/>
-            </w:pPr>
-            <w:r>
-              <w:rPr>
-                <w:color w:val="1565C0"/>
+            <w:shd w:fill="FCE4EC" w:color="auto" w:val="clear"/>
+            <w:tcMar>
+              <w:top w:type="dxa" w:w="80"/>
+              <w:left w:type="dxa" w:w="60"/>
+              <w:bottom w:type="dxa" w:w="80"/>
+              <w:right w:type="dxa" w:w="60"/>
+            </w:tcMar>
+          </w:tcPr>
+          <w:p>
+            <w:pPr>
+              <w:jc w:val="center"/>
+            </w:pPr>
+            <w:r>
+              <w:rPr>
+                <w:color w:val="AD1457"/>
                 <w:sz w:val="30"/>
                 <w:szCs w:val="30"/>
               </w:rPr>
@@ -3912,7 +3912,7 @@
             </w:pPr>
             <w:r>
               <w:rPr>
-                <w:color w:val="1565C0"/>
+                <w:color w:val="AD1457"/>
                 <w:sz w:val="30"/>
                 <w:szCs w:val="30"/>
               </w:rPr>
@@ -4302,21 +4302,21 @@
         <w:tc>
           <w:tcPr>
             <w:tcW w:type="dxa" w:w="900"/>
-            <w:shd w:fill="E3F2FD" w:color="auto" w:val="clear"/>
-            <w:tcMar>
-              <w:top w:type="dxa" w:w="80"/>
-              <w:left w:type="dxa" w:w="60"/>
-              <w:bottom w:type="dxa" w:w="80"/>
-              <w:right w:type="dxa" w:w="60"/>
-            </w:tcMar>
-          </w:tcPr>
-          <w:p>
-            <w:pPr>
-              <w:jc w:val="center"/>
-            </w:pPr>
-            <w:r>
-              <w:rPr>
-                <w:color w:val="1565C0"/>
+            <w:shd w:fill="FCE4EC" w:color="auto" w:val="clear"/>
+            <w:tcMar>
+              <w:top w:type="dxa" w:w="80"/>
+              <w:left w:type="dxa" w:w="60"/>
+              <w:bottom w:type="dxa" w:w="80"/>
+              <w:right w:type="dxa" w:w="60"/>
+            </w:tcMar>
+          </w:tcPr>
+          <w:p>
+            <w:pPr>
+              <w:jc w:val="center"/>
+            </w:pPr>
+            <w:r>
+              <w:rPr>
+                <w:color w:val="AD1457"/>
                 <w:sz w:val="30"/>
                 <w:szCs w:val="30"/>
               </w:rPr>
@@ -4720,7 +4720,7 @@
             </w:pPr>
             <w:r>
               <w:rPr>
-                <w:color w:val="1565C0"/>
+                <w:color w:val="AD1457"/>
                 <w:sz w:val="30"/>
                 <w:szCs w:val="30"/>
               </w:rPr>
@@ -5110,21 +5110,21 @@
         <w:tc>
           <w:tcPr>
             <w:tcW w:type="dxa" w:w="900"/>
-            <w:shd w:fill="E3F2FD" w:color="auto" w:val="clear"/>
-            <w:tcMar>
-              <w:top w:type="dxa" w:w="80"/>
-              <w:left w:type="dxa" w:w="60"/>
-              <w:bottom w:type="dxa" w:w="80"/>
-              <w:right w:type="dxa" w:w="60"/>
-            </w:tcMar>
-          </w:tcPr>
-          <w:p>
-            <w:pPr>
-              <w:jc w:val="center"/>
-            </w:pPr>
-            <w:r>
-              <w:rPr>
-                <w:color w:val="1565C0"/>
+            <w:shd w:fill="FCE4EC" w:color="auto" w:val="clear"/>
+            <w:tcMar>
+              <w:top w:type="dxa" w:w="80"/>
+              <w:left w:type="dxa" w:w="60"/>
+              <w:bottom w:type="dxa" w:w="80"/>
+              <w:right w:type="dxa" w:w="60"/>
+            </w:tcMar>
+          </w:tcPr>
+          <w:p>
+            <w:pPr>
+              <w:jc w:val="center"/>
+            </w:pPr>
+            <w:r>
+              <w:rPr>
+                <w:color w:val="AD1457"/>
                 <w:sz w:val="30"/>
                 <w:szCs w:val="30"/>
               </w:rPr>
@@ -5528,7 +5528,7 @@
             </w:pPr>
             <w:r>
               <w:rPr>
-                <w:color w:val="1565C0"/>
+                <w:color w:val="AD1457"/>
                 <w:sz w:val="30"/>
                 <w:szCs w:val="30"/>
               </w:rPr>
@@ -5918,21 +5918,21 @@
         <w:tc>
           <w:tcPr>
             <w:tcW w:type="dxa" w:w="900"/>
-            <w:shd w:fill="E3F2FD" w:color="auto" w:val="clear"/>
-            <w:tcMar>
-              <w:top w:type="dxa" w:w="80"/>
-              <w:left w:type="dxa" w:w="60"/>
-              <w:bottom w:type="dxa" w:w="80"/>
-              <w:right w:type="dxa" w:w="60"/>
-            </w:tcMar>
-          </w:tcPr>
-          <w:p>
-            <w:pPr>
-              <w:jc w:val="center"/>
-            </w:pPr>
-            <w:r>
-              <w:rPr>
-                <w:color w:val="1565C0"/>
+            <w:shd w:fill="FCE4EC" w:color="auto" w:val="clear"/>
+            <w:tcMar>
+              <w:top w:type="dxa" w:w="80"/>
+              <w:left w:type="dxa" w:w="60"/>
+              <w:bottom w:type="dxa" w:w="80"/>
+              <w:right w:type="dxa" w:w="60"/>
+            </w:tcMar>
+          </w:tcPr>
+          <w:p>
+            <w:pPr>
+              <w:jc w:val="center"/>
+            </w:pPr>
+            <w:r>
+              <w:rPr>
+                <w:color w:val="AD1457"/>
                 <w:sz w:val="30"/>
                 <w:szCs w:val="30"/>
               </w:rPr>
@@ -6336,7 +6336,7 @@
             </w:pPr>
             <w:r>
               <w:rPr>
-                <w:color w:val="1565C0"/>
+                <w:color w:val="AD1457"/>
                 <w:sz w:val="30"/>
                 <w:szCs w:val="30"/>
               </w:rPr>
@@ -6726,21 +6726,21 @@
         <w:tc>
           <w:tcPr>
             <w:tcW w:type="dxa" w:w="900"/>
-            <w:shd w:fill="E3F2FD" w:color="auto" w:val="clear"/>
-            <w:tcMar>
-              <w:top w:type="dxa" w:w="80"/>
-              <w:left w:type="dxa" w:w="60"/>
-              <w:bottom w:type="dxa" w:w="80"/>
-              <w:right w:type="dxa" w:w="60"/>
-            </w:tcMar>
-          </w:tcPr>
-          <w:p>
-            <w:pPr>
-              <w:jc w:val="center"/>
-            </w:pPr>
-            <w:r>
-              <w:rPr>
-                <w:color w:val="1565C0"/>
+            <w:shd w:fill="FCE4EC" w:color="auto" w:val="clear"/>
+            <w:tcMar>
+              <w:top w:type="dxa" w:w="80"/>
+              <w:left w:type="dxa" w:w="60"/>
+              <w:bottom w:type="dxa" w:w="80"/>
+              <w:right w:type="dxa" w:w="60"/>
+            </w:tcMar>
+          </w:tcPr>
+          <w:p>
+            <w:pPr>
+              <w:jc w:val="center"/>
+            </w:pPr>
+            <w:r>
+              <w:rPr>
+                <w:color w:val="AD1457"/>
                 <w:sz w:val="30"/>
                 <w:szCs w:val="30"/>
               </w:rPr>
@@ -7144,7 +7144,7 @@
             </w:pPr>
             <w:r>
               <w:rPr>
-                <w:color w:val="1565C0"/>
+                <w:color w:val="AD1457"/>
                 <w:sz w:val="30"/>
                 <w:szCs w:val="30"/>
               </w:rPr>

</xml_diff>

<commit_message>
Prefill 7/25 (練習) row: check everything except 帽子/塩分/靴 and match items
</commit_message>
<xml_diff>
--- a/scratchpad/soccer_checklist.docx
+++ b/scratchpad/soccer_checklist.docx
@@ -785,235 +785,238 @@
             </w:pPr>
             <w:r>
               <w:rPr>
-                <w:sz w:val="22"/>
-                <w:szCs w:val="22"/>
-              </w:rPr>
-              <w:t xml:space="preserve"/>
-            </w:r>
-          </w:p>
-        </w:tc>
-        <w:tc>
-          <w:tcPr>
-            <w:tcW w:type="dxa" w:w="900"/>
-            <w:shd w:fill="E3F2FD" w:color="auto" w:val="clear"/>
-            <w:tcMar>
-              <w:top w:type="dxa" w:w="80"/>
-              <w:left w:type="dxa" w:w="60"/>
-              <w:bottom w:type="dxa" w:w="80"/>
-              <w:right w:type="dxa" w:w="60"/>
-            </w:tcMar>
-          </w:tcPr>
-          <w:p>
-            <w:pPr>
-              <w:jc w:val="center"/>
-            </w:pPr>
-            <w:r>
-              <w:rPr>
-                <w:color w:val="1565C0"/>
-                <w:sz w:val="30"/>
-                <w:szCs w:val="30"/>
-              </w:rPr>
-              <w:t xml:space="preserve">☐</w:t>
-            </w:r>
-          </w:p>
-        </w:tc>
-        <w:tc>
-          <w:tcPr>
-            <w:tcW w:type="dxa" w:w="900"/>
-            <w:shd w:fill="E3F2FD" w:color="auto" w:val="clear"/>
-            <w:tcMar>
-              <w:top w:type="dxa" w:w="80"/>
-              <w:left w:type="dxa" w:w="60"/>
-              <w:bottom w:type="dxa" w:w="80"/>
-              <w:right w:type="dxa" w:w="60"/>
-            </w:tcMar>
-          </w:tcPr>
-          <w:p>
-            <w:pPr>
-              <w:jc w:val="center"/>
-            </w:pPr>
-            <w:r>
-              <w:rPr>
-                <w:color w:val="1565C0"/>
-                <w:sz w:val="30"/>
-                <w:szCs w:val="30"/>
-              </w:rPr>
-              <w:t xml:space="preserve">☐</w:t>
-            </w:r>
-          </w:p>
-        </w:tc>
-        <w:tc>
-          <w:tcPr>
-            <w:tcW w:type="dxa" w:w="900"/>
-            <w:shd w:fill="E3F2FD" w:color="auto" w:val="clear"/>
-            <w:tcMar>
-              <w:top w:type="dxa" w:w="80"/>
-              <w:left w:type="dxa" w:w="60"/>
-              <w:bottom w:type="dxa" w:w="80"/>
-              <w:right w:type="dxa" w:w="60"/>
-            </w:tcMar>
-          </w:tcPr>
-          <w:p>
-            <w:pPr>
-              <w:jc w:val="center"/>
-            </w:pPr>
-            <w:r>
-              <w:rPr>
-                <w:color w:val="1565C0"/>
-                <w:sz w:val="30"/>
-                <w:szCs w:val="30"/>
-              </w:rPr>
-              <w:t xml:space="preserve">☐</w:t>
-            </w:r>
-          </w:p>
-        </w:tc>
-        <w:tc>
-          <w:tcPr>
-            <w:tcW w:type="dxa" w:w="900"/>
-            <w:shd w:fill="E3F2FD" w:color="auto" w:val="clear"/>
-            <w:tcMar>
-              <w:top w:type="dxa" w:w="80"/>
-              <w:left w:type="dxa" w:w="60"/>
-              <w:bottom w:type="dxa" w:w="80"/>
-              <w:right w:type="dxa" w:w="60"/>
-            </w:tcMar>
-          </w:tcPr>
-          <w:p>
-            <w:pPr>
-              <w:jc w:val="center"/>
-            </w:pPr>
-            <w:r>
-              <w:rPr>
-                <w:color w:val="1565C0"/>
-                <w:sz w:val="30"/>
-                <w:szCs w:val="30"/>
-              </w:rPr>
-              <w:t xml:space="preserve">☐</w:t>
-            </w:r>
-          </w:p>
-        </w:tc>
-        <w:tc>
-          <w:tcPr>
-            <w:tcW w:type="dxa" w:w="900"/>
-            <w:shd w:fill="E3F2FD" w:color="auto" w:val="clear"/>
-            <w:tcMar>
-              <w:top w:type="dxa" w:w="80"/>
-              <w:left w:type="dxa" w:w="60"/>
-              <w:bottom w:type="dxa" w:w="80"/>
-              <w:right w:type="dxa" w:w="60"/>
-            </w:tcMar>
-          </w:tcPr>
-          <w:p>
-            <w:pPr>
-              <w:jc w:val="center"/>
-            </w:pPr>
-            <w:r>
-              <w:rPr>
-                <w:color w:val="1565C0"/>
-                <w:sz w:val="30"/>
-                <w:szCs w:val="30"/>
-              </w:rPr>
-              <w:t xml:space="preserve">☐</w:t>
-            </w:r>
-          </w:p>
-        </w:tc>
-        <w:tc>
-          <w:tcPr>
-            <w:tcW w:type="dxa" w:w="900"/>
-            <w:shd w:fill="E3F2FD" w:color="auto" w:val="clear"/>
-            <w:tcMar>
-              <w:top w:type="dxa" w:w="80"/>
-              <w:left w:type="dxa" w:w="60"/>
-              <w:bottom w:type="dxa" w:w="80"/>
-              <w:right w:type="dxa" w:w="60"/>
-            </w:tcMar>
-          </w:tcPr>
-          <w:p>
-            <w:pPr>
-              <w:jc w:val="center"/>
-            </w:pPr>
-            <w:r>
-              <w:rPr>
-                <w:color w:val="1565C0"/>
-                <w:sz w:val="30"/>
-                <w:szCs w:val="30"/>
-              </w:rPr>
-              <w:t xml:space="preserve">☐</w:t>
-            </w:r>
-          </w:p>
-        </w:tc>
-        <w:tc>
-          <w:tcPr>
-            <w:tcW w:type="dxa" w:w="900"/>
-            <w:shd w:fill="E3F2FD" w:color="auto" w:val="clear"/>
-            <w:tcMar>
-              <w:top w:type="dxa" w:w="80"/>
-              <w:left w:type="dxa" w:w="60"/>
-              <w:bottom w:type="dxa" w:w="80"/>
-              <w:right w:type="dxa" w:w="60"/>
-            </w:tcMar>
-          </w:tcPr>
-          <w:p>
-            <w:pPr>
-              <w:jc w:val="center"/>
-            </w:pPr>
-            <w:r>
-              <w:rPr>
-                <w:color w:val="1565C0"/>
-                <w:sz w:val="30"/>
-                <w:szCs w:val="30"/>
-              </w:rPr>
-              <w:t xml:space="preserve">☐</w:t>
-            </w:r>
-          </w:p>
-        </w:tc>
-        <w:tc>
-          <w:tcPr>
-            <w:tcW w:type="dxa" w:w="900"/>
-            <w:shd w:fill="E3F2FD" w:color="auto" w:val="clear"/>
-            <w:tcMar>
-              <w:top w:type="dxa" w:w="80"/>
-              <w:left w:type="dxa" w:w="60"/>
-              <w:bottom w:type="dxa" w:w="80"/>
-              <w:right w:type="dxa" w:w="60"/>
-            </w:tcMar>
-          </w:tcPr>
-          <w:p>
-            <w:pPr>
-              <w:jc w:val="center"/>
-            </w:pPr>
-            <w:r>
-              <w:rPr>
-                <w:color w:val="1565C0"/>
-                <w:sz w:val="30"/>
-                <w:szCs w:val="30"/>
-              </w:rPr>
-              <w:t xml:space="preserve">☐</w:t>
-            </w:r>
-          </w:p>
-        </w:tc>
-        <w:tc>
-          <w:tcPr>
-            <w:tcW w:type="dxa" w:w="900"/>
-            <w:shd w:fill="E3F2FD" w:color="auto" w:val="clear"/>
-            <w:tcMar>
-              <w:top w:type="dxa" w:w="80"/>
-              <w:left w:type="dxa" w:w="60"/>
-              <w:bottom w:type="dxa" w:w="80"/>
-              <w:right w:type="dxa" w:w="60"/>
-            </w:tcMar>
-          </w:tcPr>
-          <w:p>
-            <w:pPr>
-              <w:jc w:val="center"/>
-            </w:pPr>
-            <w:r>
-              <w:rPr>
-                <w:color w:val="1565C0"/>
-                <w:sz w:val="30"/>
-                <w:szCs w:val="30"/>
-              </w:rPr>
-              <w:t xml:space="preserve">☐</w:t>
+                <w:b/>
+                <w:bCs/>
+                <w:color w:val="5D4037"/>
+                <w:sz w:val="20"/>
+                <w:szCs w:val="20"/>
+              </w:rPr>
+              <w:t xml:space="preserve">7/25 (練習)</w:t>
+            </w:r>
+          </w:p>
+        </w:tc>
+        <w:tc>
+          <w:tcPr>
+            <w:tcW w:type="dxa" w:w="900"/>
+            <w:shd w:fill="E3F2FD" w:color="auto" w:val="clear"/>
+            <w:tcMar>
+              <w:top w:type="dxa" w:w="80"/>
+              <w:left w:type="dxa" w:w="60"/>
+              <w:bottom w:type="dxa" w:w="80"/>
+              <w:right w:type="dxa" w:w="60"/>
+            </w:tcMar>
+          </w:tcPr>
+          <w:p>
+            <w:pPr>
+              <w:jc w:val="center"/>
+            </w:pPr>
+            <w:r>
+              <w:rPr>
+                <w:color w:val="1565C0"/>
+                <w:sz w:val="30"/>
+                <w:szCs w:val="30"/>
+              </w:rPr>
+              <w:t xml:space="preserve">☑</w:t>
+            </w:r>
+          </w:p>
+        </w:tc>
+        <w:tc>
+          <w:tcPr>
+            <w:tcW w:type="dxa" w:w="900"/>
+            <w:shd w:fill="E3F2FD" w:color="auto" w:val="clear"/>
+            <w:tcMar>
+              <w:top w:type="dxa" w:w="80"/>
+              <w:left w:type="dxa" w:w="60"/>
+              <w:bottom w:type="dxa" w:w="80"/>
+              <w:right w:type="dxa" w:w="60"/>
+            </w:tcMar>
+          </w:tcPr>
+          <w:p>
+            <w:pPr>
+              <w:jc w:val="center"/>
+            </w:pPr>
+            <w:r>
+              <w:rPr>
+                <w:color w:val="1565C0"/>
+                <w:sz w:val="30"/>
+                <w:szCs w:val="30"/>
+              </w:rPr>
+              <w:t xml:space="preserve">☑</w:t>
+            </w:r>
+          </w:p>
+        </w:tc>
+        <w:tc>
+          <w:tcPr>
+            <w:tcW w:type="dxa" w:w="900"/>
+            <w:shd w:fill="E3F2FD" w:color="auto" w:val="clear"/>
+            <w:tcMar>
+              <w:top w:type="dxa" w:w="80"/>
+              <w:left w:type="dxa" w:w="60"/>
+              <w:bottom w:type="dxa" w:w="80"/>
+              <w:right w:type="dxa" w:w="60"/>
+            </w:tcMar>
+          </w:tcPr>
+          <w:p>
+            <w:pPr>
+              <w:jc w:val="center"/>
+            </w:pPr>
+            <w:r>
+              <w:rPr>
+                <w:color w:val="1565C0"/>
+                <w:sz w:val="30"/>
+                <w:szCs w:val="30"/>
+              </w:rPr>
+              <w:t xml:space="preserve">☑</w:t>
+            </w:r>
+          </w:p>
+        </w:tc>
+        <w:tc>
+          <w:tcPr>
+            <w:tcW w:type="dxa" w:w="900"/>
+            <w:shd w:fill="E3F2FD" w:color="auto" w:val="clear"/>
+            <w:tcMar>
+              <w:top w:type="dxa" w:w="80"/>
+              <w:left w:type="dxa" w:w="60"/>
+              <w:bottom w:type="dxa" w:w="80"/>
+              <w:right w:type="dxa" w:w="60"/>
+            </w:tcMar>
+          </w:tcPr>
+          <w:p>
+            <w:pPr>
+              <w:jc w:val="center"/>
+            </w:pPr>
+            <w:r>
+              <w:rPr>
+                <w:color w:val="1565C0"/>
+                <w:sz w:val="30"/>
+                <w:szCs w:val="30"/>
+              </w:rPr>
+              <w:t xml:space="preserve">☑</w:t>
+            </w:r>
+          </w:p>
+        </w:tc>
+        <w:tc>
+          <w:tcPr>
+            <w:tcW w:type="dxa" w:w="900"/>
+            <w:shd w:fill="E3F2FD" w:color="auto" w:val="clear"/>
+            <w:tcMar>
+              <w:top w:type="dxa" w:w="80"/>
+              <w:left w:type="dxa" w:w="60"/>
+              <w:bottom w:type="dxa" w:w="80"/>
+              <w:right w:type="dxa" w:w="60"/>
+            </w:tcMar>
+          </w:tcPr>
+          <w:p>
+            <w:pPr>
+              <w:jc w:val="center"/>
+            </w:pPr>
+            <w:r>
+              <w:rPr>
+                <w:color w:val="1565C0"/>
+                <w:sz w:val="30"/>
+                <w:szCs w:val="30"/>
+              </w:rPr>
+              <w:t xml:space="preserve">☑</w:t>
+            </w:r>
+          </w:p>
+        </w:tc>
+        <w:tc>
+          <w:tcPr>
+            <w:tcW w:type="dxa" w:w="900"/>
+            <w:shd w:fill="E3F2FD" w:color="auto" w:val="clear"/>
+            <w:tcMar>
+              <w:top w:type="dxa" w:w="80"/>
+              <w:left w:type="dxa" w:w="60"/>
+              <w:bottom w:type="dxa" w:w="80"/>
+              <w:right w:type="dxa" w:w="60"/>
+            </w:tcMar>
+          </w:tcPr>
+          <w:p>
+            <w:pPr>
+              <w:jc w:val="center"/>
+            </w:pPr>
+            <w:r>
+              <w:rPr>
+                <w:color w:val="1565C0"/>
+                <w:sz w:val="30"/>
+                <w:szCs w:val="30"/>
+              </w:rPr>
+              <w:t xml:space="preserve">☑</w:t>
+            </w:r>
+          </w:p>
+        </w:tc>
+        <w:tc>
+          <w:tcPr>
+            <w:tcW w:type="dxa" w:w="900"/>
+            <w:shd w:fill="E3F2FD" w:color="auto" w:val="clear"/>
+            <w:tcMar>
+              <w:top w:type="dxa" w:w="80"/>
+              <w:left w:type="dxa" w:w="60"/>
+              <w:bottom w:type="dxa" w:w="80"/>
+              <w:right w:type="dxa" w:w="60"/>
+            </w:tcMar>
+          </w:tcPr>
+          <w:p>
+            <w:pPr>
+              <w:jc w:val="center"/>
+            </w:pPr>
+            <w:r>
+              <w:rPr>
+                <w:color w:val="1565C0"/>
+                <w:sz w:val="30"/>
+                <w:szCs w:val="30"/>
+              </w:rPr>
+              <w:t xml:space="preserve">☑</w:t>
+            </w:r>
+          </w:p>
+        </w:tc>
+        <w:tc>
+          <w:tcPr>
+            <w:tcW w:type="dxa" w:w="900"/>
+            <w:shd w:fill="E3F2FD" w:color="auto" w:val="clear"/>
+            <w:tcMar>
+              <w:top w:type="dxa" w:w="80"/>
+              <w:left w:type="dxa" w:w="60"/>
+              <w:bottom w:type="dxa" w:w="80"/>
+              <w:right w:type="dxa" w:w="60"/>
+            </w:tcMar>
+          </w:tcPr>
+          <w:p>
+            <w:pPr>
+              <w:jc w:val="center"/>
+            </w:pPr>
+            <w:r>
+              <w:rPr>
+                <w:color w:val="1565C0"/>
+                <w:sz w:val="30"/>
+                <w:szCs w:val="30"/>
+              </w:rPr>
+              <w:t xml:space="preserve">☐</w:t>
+            </w:r>
+          </w:p>
+        </w:tc>
+        <w:tc>
+          <w:tcPr>
+            <w:tcW w:type="dxa" w:w="900"/>
+            <w:shd w:fill="E3F2FD" w:color="auto" w:val="clear"/>
+            <w:tcMar>
+              <w:top w:type="dxa" w:w="80"/>
+              <w:left w:type="dxa" w:w="60"/>
+              <w:bottom w:type="dxa" w:w="80"/>
+              <w:right w:type="dxa" w:w="60"/>
+            </w:tcMar>
+          </w:tcPr>
+          <w:p>
+            <w:pPr>
+              <w:jc w:val="center"/>
+            </w:pPr>
+            <w:r>
+              <w:rPr>
+                <w:color w:val="1565C0"/>
+                <w:sz w:val="30"/>
+                <w:szCs w:val="30"/>
+              </w:rPr>
+              <w:t xml:space="preserve">☑</w:t>
             </w:r>
           </w:p>
         </w:tc>
@@ -1189,8 +1192,11 @@
             </w:pPr>
             <w:r>
               <w:rPr>
-                <w:sz w:val="22"/>
-                <w:szCs w:val="22"/>
+                <w:b w:val="false"/>
+                <w:bCs w:val="false"/>
+                <w:color w:val="5D4037"/>
+                <w:sz w:val="20"/>
+                <w:szCs w:val="20"/>
               </w:rPr>
               <w:t xml:space="preserve"/>
             </w:r>
@@ -1593,8 +1599,11 @@
             </w:pPr>
             <w:r>
               <w:rPr>
-                <w:sz w:val="22"/>
-                <w:szCs w:val="22"/>
+                <w:b w:val="false"/>
+                <w:bCs w:val="false"/>
+                <w:color w:val="5D4037"/>
+                <w:sz w:val="20"/>
+                <w:szCs w:val="20"/>
               </w:rPr>
               <w:t xml:space="preserve"/>
             </w:r>
@@ -1997,8 +2006,11 @@
             </w:pPr>
             <w:r>
               <w:rPr>
-                <w:sz w:val="22"/>
-                <w:szCs w:val="22"/>
+                <w:b w:val="false"/>
+                <w:bCs w:val="false"/>
+                <w:color w:val="5D4037"/>
+                <w:sz w:val="20"/>
+                <w:szCs w:val="20"/>
               </w:rPr>
               <w:t xml:space="preserve"/>
             </w:r>
@@ -2401,8 +2413,11 @@
             </w:pPr>
             <w:r>
               <w:rPr>
-                <w:sz w:val="22"/>
-                <w:szCs w:val="22"/>
+                <w:b w:val="false"/>
+                <w:bCs w:val="false"/>
+                <w:color w:val="5D4037"/>
+                <w:sz w:val="20"/>
+                <w:szCs w:val="20"/>
               </w:rPr>
               <w:t xml:space="preserve"/>
             </w:r>
@@ -2805,8 +2820,11 @@
             </w:pPr>
             <w:r>
               <w:rPr>
-                <w:sz w:val="22"/>
-                <w:szCs w:val="22"/>
+                <w:b w:val="false"/>
+                <w:bCs w:val="false"/>
+                <w:color w:val="5D4037"/>
+                <w:sz w:val="20"/>
+                <w:szCs w:val="20"/>
               </w:rPr>
               <w:t xml:space="preserve"/>
             </w:r>
@@ -3209,8 +3227,11 @@
             </w:pPr>
             <w:r>
               <w:rPr>
-                <w:sz w:val="22"/>
-                <w:szCs w:val="22"/>
+                <w:b w:val="false"/>
+                <w:bCs w:val="false"/>
+                <w:color w:val="5D4037"/>
+                <w:sz w:val="20"/>
+                <w:szCs w:val="20"/>
               </w:rPr>
               <w:t xml:space="preserve"/>
             </w:r>
@@ -3613,8 +3634,11 @@
             </w:pPr>
             <w:r>
               <w:rPr>
-                <w:sz w:val="22"/>
-                <w:szCs w:val="22"/>
+                <w:b w:val="false"/>
+                <w:bCs w:val="false"/>
+                <w:color w:val="5D4037"/>
+                <w:sz w:val="20"/>
+                <w:szCs w:val="20"/>
               </w:rPr>
               <w:t xml:space="preserve"/>
             </w:r>
@@ -4017,8 +4041,11 @@
             </w:pPr>
             <w:r>
               <w:rPr>
-                <w:sz w:val="22"/>
-                <w:szCs w:val="22"/>
+                <w:b w:val="false"/>
+                <w:bCs w:val="false"/>
+                <w:color w:val="5D4037"/>
+                <w:sz w:val="20"/>
+                <w:szCs w:val="20"/>
               </w:rPr>
               <w:t xml:space="preserve"/>
             </w:r>
@@ -4421,8 +4448,11 @@
             </w:pPr>
             <w:r>
               <w:rPr>
-                <w:sz w:val="22"/>
-                <w:szCs w:val="22"/>
+                <w:b w:val="false"/>
+                <w:bCs w:val="false"/>
+                <w:color w:val="5D4037"/>
+                <w:sz w:val="20"/>
+                <w:szCs w:val="20"/>
               </w:rPr>
               <w:t xml:space="preserve"/>
             </w:r>
@@ -4825,8 +4855,11 @@
             </w:pPr>
             <w:r>
               <w:rPr>
-                <w:sz w:val="22"/>
-                <w:szCs w:val="22"/>
+                <w:b w:val="false"/>
+                <w:bCs w:val="false"/>
+                <w:color w:val="5D4037"/>
+                <w:sz w:val="20"/>
+                <w:szCs w:val="20"/>
               </w:rPr>
               <w:t xml:space="preserve"/>
             </w:r>
@@ -5229,8 +5262,11 @@
             </w:pPr>
             <w:r>
               <w:rPr>
-                <w:sz w:val="22"/>
-                <w:szCs w:val="22"/>
+                <w:b w:val="false"/>
+                <w:bCs w:val="false"/>
+                <w:color w:val="5D4037"/>
+                <w:sz w:val="20"/>
+                <w:szCs w:val="20"/>
               </w:rPr>
               <w:t xml:space="preserve"/>
             </w:r>
@@ -5633,8 +5669,11 @@
             </w:pPr>
             <w:r>
               <w:rPr>
-                <w:sz w:val="22"/>
-                <w:szCs w:val="22"/>
+                <w:b w:val="false"/>
+                <w:bCs w:val="false"/>
+                <w:color w:val="5D4037"/>
+                <w:sz w:val="20"/>
+                <w:szCs w:val="20"/>
               </w:rPr>
               <w:t xml:space="preserve"/>
             </w:r>
@@ -6037,8 +6076,11 @@
             </w:pPr>
             <w:r>
               <w:rPr>
-                <w:sz w:val="22"/>
-                <w:szCs w:val="22"/>
+                <w:b w:val="false"/>
+                <w:bCs w:val="false"/>
+                <w:color w:val="5D4037"/>
+                <w:sz w:val="20"/>
+                <w:szCs w:val="20"/>
               </w:rPr>
               <w:t xml:space="preserve"/>
             </w:r>
@@ -6441,8 +6483,11 @@
             </w:pPr>
             <w:r>
               <w:rPr>
-                <w:sz w:val="22"/>
-                <w:szCs w:val="22"/>
+                <w:b w:val="false"/>
+                <w:bCs w:val="false"/>
+                <w:color w:val="5D4037"/>
+                <w:sz w:val="20"/>
+                <w:szCs w:val="20"/>
               </w:rPr>
               <w:t xml:space="preserve"/>
             </w:r>
@@ -6845,8 +6890,11 @@
             </w:pPr>
             <w:r>
               <w:rPr>
-                <w:sz w:val="22"/>
-                <w:szCs w:val="22"/>
+                <w:b w:val="false"/>
+                <w:bCs w:val="false"/>
+                <w:color w:val="5D4037"/>
+                <w:sz w:val="20"/>
+                <w:szCs w:val="20"/>
               </w:rPr>
               <w:t xml:space="preserve"/>
             </w:r>

</xml_diff>